<commit_message>
tables_v5: A4 layout, one table per page, fixed column widths
- A4 with 3 cm margins (was US Letter, 2.5 cm)
- page break before Tables 1B, 2, 3, 4 and cantSplit on every row, so no table
  splits across pages
- fixed table layout with explicit widths: model names and "AUROC" no longer
  break mid-word; Table 2 headers shortened to Sens./Spec.
- final_files refreshed from the generators

Discord: https://discord.com/channels/1558830378104529049/1564511452818055292
</commit_message>
<xml_diff>
--- a/paper_submission/revision4/tables_v5.docx
+++ b/paper_submission/revision4/tables_v5.docx
@@ -29,6 +29,7 @@
           <w:insideH w:val="none" w:sz="0" w:space="0" w:color="000000"/>
           <w:insideV w:val="none" w:sz="0" w:space="0" w:color="000000"/>
         </w:tblBorders>
+        <w:tblLayout w:type="fixed"/>
       </w:tblPr>
       <w:tblGrid>
         <w:gridCol w:w="3120"/>
@@ -36,6 +37,9 @@
         <w:gridCol w:w="3120"/>
       </w:tblGrid>
       <w:tr>
+        <w:trPr>
+          <w:cantSplit/>
+        </w:trPr>
         <w:tc>
           <w:tcPr>
             <w:tcW w:type="dxa" w:w="3120"/>
@@ -107,6 +111,9 @@
         </w:tc>
       </w:tr>
       <w:tr>
+        <w:trPr>
+          <w:cantSplit/>
+        </w:trPr>
         <w:tc>
           <w:tcPr>
             <w:tcW w:type="dxa" w:w="3120"/>
@@ -163,6 +170,9 @@
         </w:tc>
       </w:tr>
       <w:tr>
+        <w:trPr>
+          <w:cantSplit/>
+        </w:trPr>
         <w:tc>
           <w:tcPr>
             <w:tcW w:type="dxa" w:w="3120"/>
@@ -219,6 +229,9 @@
         </w:tc>
       </w:tr>
       <w:tr>
+        <w:trPr>
+          <w:cantSplit/>
+        </w:trPr>
         <w:tc>
           <w:tcPr>
             <w:tcW w:type="dxa" w:w="3120"/>
@@ -275,6 +288,9 @@
         </w:tc>
       </w:tr>
       <w:tr>
+        <w:trPr>
+          <w:cantSplit/>
+        </w:trPr>
         <w:tc>
           <w:tcPr>
             <w:tcW w:type="dxa" w:w="3120"/>
@@ -331,6 +347,9 @@
         </w:tc>
       </w:tr>
       <w:tr>
+        <w:trPr>
+          <w:cantSplit/>
+        </w:trPr>
         <w:tc>
           <w:tcPr>
             <w:tcW w:type="dxa" w:w="3120"/>
@@ -387,6 +406,9 @@
         </w:tc>
       </w:tr>
       <w:tr>
+        <w:trPr>
+          <w:cantSplit/>
+        </w:trPr>
         <w:tc>
           <w:tcPr>
             <w:tcW w:type="dxa" w:w="3120"/>
@@ -443,6 +465,9 @@
         </w:tc>
       </w:tr>
       <w:tr>
+        <w:trPr>
+          <w:cantSplit/>
+        </w:trPr>
         <w:tc>
           <w:tcPr>
             <w:tcW w:type="dxa" w:w="3120"/>
@@ -497,6 +522,9 @@
         </w:tc>
       </w:tr>
       <w:tr>
+        <w:trPr>
+          <w:cantSplit/>
+        </w:trPr>
         <w:tc>
           <w:tcPr>
             <w:tcW w:type="dxa" w:w="3120"/>
@@ -553,6 +581,9 @@
         </w:tc>
       </w:tr>
       <w:tr>
+        <w:trPr>
+          <w:cantSplit/>
+        </w:trPr>
         <w:tc>
           <w:tcPr>
             <w:tcW w:type="dxa" w:w="3120"/>
@@ -609,6 +640,9 @@
         </w:tc>
       </w:tr>
       <w:tr>
+        <w:trPr>
+          <w:cantSplit/>
+        </w:trPr>
         <w:tc>
           <w:tcPr>
             <w:tcW w:type="dxa" w:w="3120"/>
@@ -665,6 +699,9 @@
         </w:tc>
       </w:tr>
       <w:tr>
+        <w:trPr>
+          <w:cantSplit/>
+        </w:trPr>
         <w:tc>
           <w:tcPr>
             <w:tcW w:type="dxa" w:w="3120"/>
@@ -721,6 +758,9 @@
         </w:tc>
       </w:tr>
       <w:tr>
+        <w:trPr>
+          <w:cantSplit/>
+        </w:trPr>
         <w:tc>
           <w:tcPr>
             <w:tcW w:type="dxa" w:w="3120"/>
@@ -775,6 +815,9 @@
         </w:tc>
       </w:tr>
       <w:tr>
+        <w:trPr>
+          <w:cantSplit/>
+        </w:trPr>
         <w:tc>
           <w:tcPr>
             <w:tcW w:type="dxa" w:w="3120"/>
@@ -831,6 +874,9 @@
         </w:tc>
       </w:tr>
       <w:tr>
+        <w:trPr>
+          <w:cantSplit/>
+        </w:trPr>
         <w:tc>
           <w:tcPr>
             <w:tcW w:type="dxa" w:w="3120"/>
@@ -887,6 +933,9 @@
         </w:tc>
       </w:tr>
       <w:tr>
+        <w:trPr>
+          <w:cantSplit/>
+        </w:trPr>
         <w:tc>
           <w:tcPr>
             <w:tcW w:type="dxa" w:w="3120"/>
@@ -943,6 +992,9 @@
         </w:tc>
       </w:tr>
       <w:tr>
+        <w:trPr>
+          <w:cantSplit/>
+        </w:trPr>
         <w:tc>
           <w:tcPr>
             <w:tcW w:type="dxa" w:w="3120"/>
@@ -1015,6 +1067,7 @@
     </w:p>
     <w:p>
       <w:pPr>
+        <w:pageBreakBefore/>
         <w:spacing w:before="280" w:after="80"/>
       </w:pPr>
       <w:r>
@@ -1039,6 +1092,7 @@
           <w:insideH w:val="none" w:sz="0" w:space="0" w:color="000000"/>
           <w:insideV w:val="none" w:sz="0" w:space="0" w:color="000000"/>
         </w:tblBorders>
+        <w:tblLayout w:type="fixed"/>
       </w:tblPr>
       <w:tblGrid>
         <w:gridCol w:w="1560"/>
@@ -1049,6 +1103,9 @@
         <w:gridCol w:w="1560"/>
       </w:tblGrid>
       <w:tr>
+        <w:trPr>
+          <w:cantSplit/>
+        </w:trPr>
         <w:tc>
           <w:tcPr>
             <w:tcW w:type="dxa" w:w="1560"/>
@@ -1189,6 +1246,9 @@
         </w:tc>
       </w:tr>
       <w:tr>
+        <w:trPr>
+          <w:cantSplit/>
+        </w:trPr>
         <w:tc>
           <w:tcPr>
             <w:tcW w:type="dxa" w:w="1560"/>
@@ -1299,6 +1359,9 @@
         </w:tc>
       </w:tr>
       <w:tr>
+        <w:trPr>
+          <w:cantSplit/>
+        </w:trPr>
         <w:tc>
           <w:tcPr>
             <w:tcW w:type="dxa" w:w="1560"/>
@@ -1409,6 +1472,9 @@
         </w:tc>
       </w:tr>
       <w:tr>
+        <w:trPr>
+          <w:cantSplit/>
+        </w:trPr>
         <w:tc>
           <w:tcPr>
             <w:tcW w:type="dxa" w:w="1560"/>
@@ -1541,6 +1607,7 @@
     </w:p>
     <w:p>
       <w:pPr>
+        <w:pageBreakBefore/>
         <w:spacing w:before="280" w:after="80"/>
       </w:pPr>
       <w:r>
@@ -1566,21 +1633,25 @@
           <w:insideH w:val="none" w:sz="0" w:space="0" w:color="000000"/>
           <w:insideV w:val="none" w:sz="0" w:space="0" w:color="000000"/>
         </w:tblBorders>
+        <w:tblLayout w:type="fixed"/>
       </w:tblPr>
       <w:tblGrid>
-        <w:gridCol w:w="1170"/>
-        <w:gridCol w:w="1170"/>
-        <w:gridCol w:w="1170"/>
-        <w:gridCol w:w="1170"/>
-        <w:gridCol w:w="1170"/>
-        <w:gridCol w:w="1170"/>
-        <w:gridCol w:w="1170"/>
-        <w:gridCol w:w="1170"/>
+        <w:gridCol w:w="454"/>
+        <w:gridCol w:w="1814"/>
+        <w:gridCol w:w="1304"/>
+        <w:gridCol w:w="1077"/>
+        <w:gridCol w:w="964"/>
+        <w:gridCol w:w="964"/>
+        <w:gridCol w:w="964"/>
+        <w:gridCol w:w="907"/>
       </w:tblGrid>
       <w:tr>
+        <w:trPr>
+          <w:cantSplit/>
+        </w:trPr>
         <w:tc>
           <w:tcPr>
-            <w:tcW w:type="dxa" w:w="1170"/>
+            <w:tcW w:type="dxa" w:w="454"/>
             <w:shd w:fill="F0F0F0"/>
             <w:tcBorders>
               <w:bottom w:val="single" w:sz="8" w:space="0" w:color="000000"/>
@@ -1603,7 +1674,7 @@
         </w:tc>
         <w:tc>
           <w:tcPr>
-            <w:tcW w:type="dxa" w:w="1170"/>
+            <w:tcW w:type="dxa" w:w="1814"/>
             <w:shd w:fill="F0F0F0"/>
             <w:tcBorders>
               <w:bottom w:val="single" w:sz="8" w:space="0" w:color="000000"/>
@@ -1626,7 +1697,7 @@
         </w:tc>
         <w:tc>
           <w:tcPr>
-            <w:tcW w:type="dxa" w:w="1170"/>
+            <w:tcW w:type="dxa" w:w="1304"/>
             <w:shd w:fill="F0F0F0"/>
             <w:tcBorders>
               <w:bottom w:val="single" w:sz="8" w:space="0" w:color="000000"/>
@@ -1649,7 +1720,7 @@
         </w:tc>
         <w:tc>
           <w:tcPr>
-            <w:tcW w:type="dxa" w:w="1170"/>
+            <w:tcW w:type="dxa" w:w="1077"/>
             <w:shd w:fill="F0F0F0"/>
             <w:tcBorders>
               <w:bottom w:val="single" w:sz="8" w:space="0" w:color="000000"/>
@@ -1672,7 +1743,7 @@
         </w:tc>
         <w:tc>
           <w:tcPr>
-            <w:tcW w:type="dxa" w:w="1170"/>
+            <w:tcW w:type="dxa" w:w="964"/>
             <w:shd w:fill="F0F0F0"/>
             <w:tcBorders>
               <w:bottom w:val="single" w:sz="8" w:space="0" w:color="000000"/>
@@ -1695,7 +1766,7 @@
         </w:tc>
         <w:tc>
           <w:tcPr>
-            <w:tcW w:type="dxa" w:w="1170"/>
+            <w:tcW w:type="dxa" w:w="964"/>
             <w:shd w:fill="F0F0F0"/>
             <w:tcBorders>
               <w:bottom w:val="single" w:sz="8" w:space="0" w:color="000000"/>
@@ -1712,13 +1783,13 @@
                 <w:b/>
                 <w:sz w:val="19"/>
               </w:rPr>
-              <w:t>Sensitivity (%)</w:t>
+              <w:t>Sens. (%)</w:t>
             </w:r>
           </w:p>
         </w:tc>
         <w:tc>
           <w:tcPr>
-            <w:tcW w:type="dxa" w:w="1170"/>
+            <w:tcW w:type="dxa" w:w="964"/>
             <w:shd w:fill="F0F0F0"/>
             <w:tcBorders>
               <w:bottom w:val="single" w:sz="8" w:space="0" w:color="000000"/>
@@ -1735,13 +1806,13 @@
                 <w:b/>
                 <w:sz w:val="19"/>
               </w:rPr>
-              <w:t>Specificity (%)</w:t>
+              <w:t>Spec. (%)</w:t>
             </w:r>
           </w:p>
         </w:tc>
         <w:tc>
           <w:tcPr>
-            <w:tcW w:type="dxa" w:w="1170"/>
+            <w:tcW w:type="dxa" w:w="907"/>
             <w:shd w:fill="F0F0F0"/>
             <w:tcBorders>
               <w:bottom w:val="single" w:sz="8" w:space="0" w:color="000000"/>
@@ -1764,9 +1835,12 @@
         </w:tc>
       </w:tr>
       <w:tr>
+        <w:trPr>
+          <w:cantSplit/>
+        </w:trPr>
         <w:tc>
           <w:tcPr>
-            <w:tcW w:type="dxa" w:w="1170"/>
+            <w:tcW w:type="dxa" w:w="454"/>
           </w:tcPr>
           <w:p>
             <w:pPr>
@@ -1784,7 +1858,7 @@
         </w:tc>
         <w:tc>
           <w:tcPr>
-            <w:tcW w:type="dxa" w:w="1170"/>
+            <w:tcW w:type="dxa" w:w="1814"/>
           </w:tcPr>
           <w:p>
             <w:pPr>
@@ -1802,7 +1876,7 @@
         </w:tc>
         <w:tc>
           <w:tcPr>
-            <w:tcW w:type="dxa" w:w="1170"/>
+            <w:tcW w:type="dxa" w:w="1304"/>
           </w:tcPr>
           <w:p>
             <w:pPr>
@@ -1820,7 +1894,7 @@
         </w:tc>
         <w:tc>
           <w:tcPr>
-            <w:tcW w:type="dxa" w:w="1170"/>
+            <w:tcW w:type="dxa" w:w="1077"/>
           </w:tcPr>
           <w:p>
             <w:pPr>
@@ -1838,7 +1912,7 @@
         </w:tc>
         <w:tc>
           <w:tcPr>
-            <w:tcW w:type="dxa" w:w="1170"/>
+            <w:tcW w:type="dxa" w:w="964"/>
           </w:tcPr>
           <w:p>
             <w:pPr>
@@ -1856,7 +1930,7 @@
         </w:tc>
         <w:tc>
           <w:tcPr>
-            <w:tcW w:type="dxa" w:w="1170"/>
+            <w:tcW w:type="dxa" w:w="964"/>
           </w:tcPr>
           <w:p>
             <w:pPr>
@@ -1874,7 +1948,7 @@
         </w:tc>
         <w:tc>
           <w:tcPr>
-            <w:tcW w:type="dxa" w:w="1170"/>
+            <w:tcW w:type="dxa" w:w="964"/>
           </w:tcPr>
           <w:p>
             <w:pPr>
@@ -1892,7 +1966,7 @@
         </w:tc>
         <w:tc>
           <w:tcPr>
-            <w:tcW w:type="dxa" w:w="1170"/>
+            <w:tcW w:type="dxa" w:w="907"/>
           </w:tcPr>
           <w:p>
             <w:pPr>
@@ -1910,9 +1984,12 @@
         </w:tc>
       </w:tr>
       <w:tr>
+        <w:trPr>
+          <w:cantSplit/>
+        </w:trPr>
         <w:tc>
           <w:tcPr>
-            <w:tcW w:type="dxa" w:w="1170"/>
+            <w:tcW w:type="dxa" w:w="454"/>
           </w:tcPr>
           <w:p>
             <w:pPr>
@@ -1930,7 +2007,7 @@
         </w:tc>
         <w:tc>
           <w:tcPr>
-            <w:tcW w:type="dxa" w:w="1170"/>
+            <w:tcW w:type="dxa" w:w="1814"/>
           </w:tcPr>
           <w:p>
             <w:pPr>
@@ -1948,7 +2025,7 @@
         </w:tc>
         <w:tc>
           <w:tcPr>
-            <w:tcW w:type="dxa" w:w="1170"/>
+            <w:tcW w:type="dxa" w:w="1304"/>
           </w:tcPr>
           <w:p>
             <w:pPr>
@@ -1966,7 +2043,7 @@
         </w:tc>
         <w:tc>
           <w:tcPr>
-            <w:tcW w:type="dxa" w:w="1170"/>
+            <w:tcW w:type="dxa" w:w="1077"/>
           </w:tcPr>
           <w:p>
             <w:pPr>
@@ -1984,7 +2061,7 @@
         </w:tc>
         <w:tc>
           <w:tcPr>
-            <w:tcW w:type="dxa" w:w="1170"/>
+            <w:tcW w:type="dxa" w:w="964"/>
           </w:tcPr>
           <w:p>
             <w:pPr>
@@ -2002,7 +2079,7 @@
         </w:tc>
         <w:tc>
           <w:tcPr>
-            <w:tcW w:type="dxa" w:w="1170"/>
+            <w:tcW w:type="dxa" w:w="964"/>
           </w:tcPr>
           <w:p>
             <w:pPr>
@@ -2020,7 +2097,7 @@
         </w:tc>
         <w:tc>
           <w:tcPr>
-            <w:tcW w:type="dxa" w:w="1170"/>
+            <w:tcW w:type="dxa" w:w="964"/>
           </w:tcPr>
           <w:p>
             <w:pPr>
@@ -2038,7 +2115,7 @@
         </w:tc>
         <w:tc>
           <w:tcPr>
-            <w:tcW w:type="dxa" w:w="1170"/>
+            <w:tcW w:type="dxa" w:w="907"/>
           </w:tcPr>
           <w:p>
             <w:pPr>
@@ -2056,9 +2133,12 @@
         </w:tc>
       </w:tr>
       <w:tr>
+        <w:trPr>
+          <w:cantSplit/>
+        </w:trPr>
         <w:tc>
           <w:tcPr>
-            <w:tcW w:type="dxa" w:w="1170"/>
+            <w:tcW w:type="dxa" w:w="454"/>
           </w:tcPr>
           <w:p>
             <w:pPr>
@@ -2076,7 +2156,7 @@
         </w:tc>
         <w:tc>
           <w:tcPr>
-            <w:tcW w:type="dxa" w:w="1170"/>
+            <w:tcW w:type="dxa" w:w="1814"/>
           </w:tcPr>
           <w:p>
             <w:pPr>
@@ -2094,7 +2174,7 @@
         </w:tc>
         <w:tc>
           <w:tcPr>
-            <w:tcW w:type="dxa" w:w="1170"/>
+            <w:tcW w:type="dxa" w:w="1304"/>
           </w:tcPr>
           <w:p>
             <w:pPr>
@@ -2112,7 +2192,7 @@
         </w:tc>
         <w:tc>
           <w:tcPr>
-            <w:tcW w:type="dxa" w:w="1170"/>
+            <w:tcW w:type="dxa" w:w="1077"/>
           </w:tcPr>
           <w:p>
             <w:pPr>
@@ -2130,7 +2210,7 @@
         </w:tc>
         <w:tc>
           <w:tcPr>
-            <w:tcW w:type="dxa" w:w="1170"/>
+            <w:tcW w:type="dxa" w:w="964"/>
           </w:tcPr>
           <w:p>
             <w:pPr>
@@ -2148,7 +2228,7 @@
         </w:tc>
         <w:tc>
           <w:tcPr>
-            <w:tcW w:type="dxa" w:w="1170"/>
+            <w:tcW w:type="dxa" w:w="964"/>
           </w:tcPr>
           <w:p>
             <w:pPr>
@@ -2166,7 +2246,7 @@
         </w:tc>
         <w:tc>
           <w:tcPr>
-            <w:tcW w:type="dxa" w:w="1170"/>
+            <w:tcW w:type="dxa" w:w="964"/>
           </w:tcPr>
           <w:p>
             <w:pPr>
@@ -2184,7 +2264,7 @@
         </w:tc>
         <w:tc>
           <w:tcPr>
-            <w:tcW w:type="dxa" w:w="1170"/>
+            <w:tcW w:type="dxa" w:w="907"/>
           </w:tcPr>
           <w:p>
             <w:pPr>
@@ -2202,9 +2282,12 @@
         </w:tc>
       </w:tr>
       <w:tr>
+        <w:trPr>
+          <w:cantSplit/>
+        </w:trPr>
         <w:tc>
           <w:tcPr>
-            <w:tcW w:type="dxa" w:w="1170"/>
+            <w:tcW w:type="dxa" w:w="454"/>
           </w:tcPr>
           <w:p>
             <w:pPr>
@@ -2223,7 +2306,7 @@
         </w:tc>
         <w:tc>
           <w:tcPr>
-            <w:tcW w:type="dxa" w:w="1170"/>
+            <w:tcW w:type="dxa" w:w="1814"/>
           </w:tcPr>
           <w:p>
             <w:pPr>
@@ -2242,7 +2325,7 @@
         </w:tc>
         <w:tc>
           <w:tcPr>
-            <w:tcW w:type="dxa" w:w="1170"/>
+            <w:tcW w:type="dxa" w:w="1304"/>
           </w:tcPr>
           <w:p>
             <w:pPr>
@@ -2261,7 +2344,7 @@
         </w:tc>
         <w:tc>
           <w:tcPr>
-            <w:tcW w:type="dxa" w:w="1170"/>
+            <w:tcW w:type="dxa" w:w="1077"/>
           </w:tcPr>
           <w:p>
             <w:pPr>
@@ -2280,7 +2363,7 @@
         </w:tc>
         <w:tc>
           <w:tcPr>
-            <w:tcW w:type="dxa" w:w="1170"/>
+            <w:tcW w:type="dxa" w:w="964"/>
           </w:tcPr>
           <w:p>
             <w:pPr>
@@ -2299,7 +2382,7 @@
         </w:tc>
         <w:tc>
           <w:tcPr>
-            <w:tcW w:type="dxa" w:w="1170"/>
+            <w:tcW w:type="dxa" w:w="964"/>
           </w:tcPr>
           <w:p>
             <w:pPr>
@@ -2318,7 +2401,7 @@
         </w:tc>
         <w:tc>
           <w:tcPr>
-            <w:tcW w:type="dxa" w:w="1170"/>
+            <w:tcW w:type="dxa" w:w="964"/>
           </w:tcPr>
           <w:p>
             <w:pPr>
@@ -2337,7 +2420,7 @@
         </w:tc>
         <w:tc>
           <w:tcPr>
-            <w:tcW w:type="dxa" w:w="1170"/>
+            <w:tcW w:type="dxa" w:w="907"/>
           </w:tcPr>
           <w:p>
             <w:pPr>
@@ -2356,9 +2439,12 @@
         </w:tc>
       </w:tr>
       <w:tr>
+        <w:trPr>
+          <w:cantSplit/>
+        </w:trPr>
         <w:tc>
           <w:tcPr>
-            <w:tcW w:type="dxa" w:w="1170"/>
+            <w:tcW w:type="dxa" w:w="454"/>
           </w:tcPr>
           <w:p>
             <w:pPr>
@@ -2376,7 +2462,7 @@
         </w:tc>
         <w:tc>
           <w:tcPr>
-            <w:tcW w:type="dxa" w:w="1170"/>
+            <w:tcW w:type="dxa" w:w="1814"/>
           </w:tcPr>
           <w:p>
             <w:pPr>
@@ -2394,7 +2480,7 @@
         </w:tc>
         <w:tc>
           <w:tcPr>
-            <w:tcW w:type="dxa" w:w="1170"/>
+            <w:tcW w:type="dxa" w:w="1304"/>
           </w:tcPr>
           <w:p>
             <w:pPr>
@@ -2412,7 +2498,7 @@
         </w:tc>
         <w:tc>
           <w:tcPr>
-            <w:tcW w:type="dxa" w:w="1170"/>
+            <w:tcW w:type="dxa" w:w="1077"/>
           </w:tcPr>
           <w:p>
             <w:pPr>
@@ -2430,7 +2516,7 @@
         </w:tc>
         <w:tc>
           <w:tcPr>
-            <w:tcW w:type="dxa" w:w="1170"/>
+            <w:tcW w:type="dxa" w:w="964"/>
           </w:tcPr>
           <w:p>
             <w:pPr>
@@ -2448,7 +2534,7 @@
         </w:tc>
         <w:tc>
           <w:tcPr>
-            <w:tcW w:type="dxa" w:w="1170"/>
+            <w:tcW w:type="dxa" w:w="964"/>
           </w:tcPr>
           <w:p>
             <w:pPr>
@@ -2466,7 +2552,7 @@
         </w:tc>
         <w:tc>
           <w:tcPr>
-            <w:tcW w:type="dxa" w:w="1170"/>
+            <w:tcW w:type="dxa" w:w="964"/>
           </w:tcPr>
           <w:p>
             <w:pPr>
@@ -2484,7 +2570,7 @@
         </w:tc>
         <w:tc>
           <w:tcPr>
-            <w:tcW w:type="dxa" w:w="1170"/>
+            <w:tcW w:type="dxa" w:w="907"/>
           </w:tcPr>
           <w:p>
             <w:pPr>
@@ -2502,9 +2588,12 @@
         </w:tc>
       </w:tr>
       <w:tr>
+        <w:trPr>
+          <w:cantSplit/>
+        </w:trPr>
         <w:tc>
           <w:tcPr>
-            <w:tcW w:type="dxa" w:w="1170"/>
+            <w:tcW w:type="dxa" w:w="454"/>
           </w:tcPr>
           <w:p>
             <w:pPr>
@@ -2522,7 +2611,7 @@
         </w:tc>
         <w:tc>
           <w:tcPr>
-            <w:tcW w:type="dxa" w:w="1170"/>
+            <w:tcW w:type="dxa" w:w="1814"/>
           </w:tcPr>
           <w:p>
             <w:pPr>
@@ -2540,7 +2629,7 @@
         </w:tc>
         <w:tc>
           <w:tcPr>
-            <w:tcW w:type="dxa" w:w="1170"/>
+            <w:tcW w:type="dxa" w:w="1304"/>
           </w:tcPr>
           <w:p>
             <w:pPr>
@@ -2558,7 +2647,7 @@
         </w:tc>
         <w:tc>
           <w:tcPr>
-            <w:tcW w:type="dxa" w:w="1170"/>
+            <w:tcW w:type="dxa" w:w="1077"/>
           </w:tcPr>
           <w:p>
             <w:pPr>
@@ -2576,7 +2665,7 @@
         </w:tc>
         <w:tc>
           <w:tcPr>
-            <w:tcW w:type="dxa" w:w="1170"/>
+            <w:tcW w:type="dxa" w:w="964"/>
           </w:tcPr>
           <w:p>
             <w:pPr>
@@ -2594,7 +2683,7 @@
         </w:tc>
         <w:tc>
           <w:tcPr>
-            <w:tcW w:type="dxa" w:w="1170"/>
+            <w:tcW w:type="dxa" w:w="964"/>
           </w:tcPr>
           <w:p>
             <w:pPr>
@@ -2612,7 +2701,7 @@
         </w:tc>
         <w:tc>
           <w:tcPr>
-            <w:tcW w:type="dxa" w:w="1170"/>
+            <w:tcW w:type="dxa" w:w="964"/>
           </w:tcPr>
           <w:p>
             <w:pPr>
@@ -2630,7 +2719,7 @@
         </w:tc>
         <w:tc>
           <w:tcPr>
-            <w:tcW w:type="dxa" w:w="1170"/>
+            <w:tcW w:type="dxa" w:w="907"/>
           </w:tcPr>
           <w:p>
             <w:pPr>
@@ -2664,6 +2753,7 @@
     </w:p>
     <w:p>
       <w:pPr>
+        <w:pageBreakBefore/>
         <w:spacing w:before="280" w:after="80"/>
       </w:pPr>
       <w:r>
@@ -2703,12 +2793,16 @@
           <w:insideH w:val="none" w:sz="0" w:space="0" w:color="000000"/>
           <w:insideV w:val="none" w:sz="0" w:space="0" w:color="000000"/>
         </w:tblBorders>
+        <w:tblLayout w:type="fixed"/>
       </w:tblPr>
       <w:tblGrid>
         <w:gridCol w:w="4680"/>
         <w:gridCol w:w="4680"/>
       </w:tblGrid>
       <w:tr>
+        <w:trPr>
+          <w:cantSplit/>
+        </w:trPr>
         <w:tc>
           <w:tcPr>
             <w:tcW w:type="dxa" w:w="4680"/>
@@ -2757,6 +2851,9 @@
         </w:tc>
       </w:tr>
       <w:tr>
+        <w:trPr>
+          <w:cantSplit/>
+        </w:trPr>
         <w:tc>
           <w:tcPr>
             <w:tcW w:type="dxa" w:w="4680"/>
@@ -2803,6 +2900,9 @@
         </w:tc>
       </w:tr>
       <w:tr>
+        <w:trPr>
+          <w:cantSplit/>
+        </w:trPr>
         <w:tc>
           <w:tcPr>
             <w:tcW w:type="dxa" w:w="4680"/>
@@ -2849,6 +2949,9 @@
         </w:tc>
       </w:tr>
       <w:tr>
+        <w:trPr>
+          <w:cantSplit/>
+        </w:trPr>
         <w:tc>
           <w:tcPr>
             <w:tcW w:type="dxa" w:w="4680"/>
@@ -2887,6 +2990,9 @@
         </w:tc>
       </w:tr>
       <w:tr>
+        <w:trPr>
+          <w:cantSplit/>
+        </w:trPr>
         <w:tc>
           <w:tcPr>
             <w:tcW w:type="dxa" w:w="4680"/>
@@ -2925,6 +3031,9 @@
         </w:tc>
       </w:tr>
       <w:tr>
+        <w:trPr>
+          <w:cantSplit/>
+        </w:trPr>
         <w:tc>
           <w:tcPr>
             <w:tcW w:type="dxa" w:w="4680"/>
@@ -2963,6 +3072,9 @@
         </w:tc>
       </w:tr>
       <w:tr>
+        <w:trPr>
+          <w:cantSplit/>
+        </w:trPr>
         <w:tc>
           <w:tcPr>
             <w:tcW w:type="dxa" w:w="4680"/>
@@ -3001,6 +3113,9 @@
         </w:tc>
       </w:tr>
       <w:tr>
+        <w:trPr>
+          <w:cantSplit/>
+        </w:trPr>
         <w:tc>
           <w:tcPr>
             <w:tcW w:type="dxa" w:w="4680"/>
@@ -3039,6 +3154,9 @@
         </w:tc>
       </w:tr>
       <w:tr>
+        <w:trPr>
+          <w:cantSplit/>
+        </w:trPr>
         <w:tc>
           <w:tcPr>
             <w:tcW w:type="dxa" w:w="4680"/>
@@ -3104,6 +3222,7 @@
           <w:insideH w:val="none" w:sz="0" w:space="0" w:color="000000"/>
           <w:insideV w:val="none" w:sz="0" w:space="0" w:color="000000"/>
         </w:tblBorders>
+        <w:tblLayout w:type="fixed"/>
       </w:tblPr>
       <w:tblGrid>
         <w:gridCol w:w="1560"/>
@@ -3114,6 +3233,9 @@
         <w:gridCol w:w="1560"/>
       </w:tblGrid>
       <w:tr>
+        <w:trPr>
+          <w:cantSplit/>
+        </w:trPr>
         <w:tc>
           <w:tcPr>
             <w:tcW w:type="dxa" w:w="1560"/>
@@ -3262,6 +3384,9 @@
         </w:tc>
       </w:tr>
       <w:tr>
+        <w:trPr>
+          <w:cantSplit/>
+        </w:trPr>
         <w:tc>
           <w:tcPr>
             <w:tcW w:type="dxa" w:w="1560"/>
@@ -3372,6 +3497,9 @@
         </w:tc>
       </w:tr>
       <w:tr>
+        <w:trPr>
+          <w:cantSplit/>
+        </w:trPr>
         <w:tc>
           <w:tcPr>
             <w:tcW w:type="dxa" w:w="1560"/>
@@ -3498,6 +3626,7 @@
     </w:p>
     <w:p>
       <w:pPr>
+        <w:pageBreakBefore/>
         <w:spacing w:before="280" w:after="80"/>
       </w:pPr>
       <w:r>
@@ -3537,20 +3666,24 @@
           <w:insideH w:val="none" w:sz="0" w:space="0" w:color="000000"/>
           <w:insideV w:val="none" w:sz="0" w:space="0" w:color="000000"/>
         </w:tblBorders>
+        <w:tblLayout w:type="fixed"/>
       </w:tblPr>
       <w:tblGrid>
-        <w:gridCol w:w="1337"/>
-        <w:gridCol w:w="1337"/>
-        <w:gridCol w:w="1337"/>
-        <w:gridCol w:w="1337"/>
-        <w:gridCol w:w="1337"/>
-        <w:gridCol w:w="1337"/>
-        <w:gridCol w:w="1337"/>
+        <w:gridCol w:w="1701"/>
+        <w:gridCol w:w="1304"/>
+        <w:gridCol w:w="1077"/>
+        <w:gridCol w:w="1077"/>
+        <w:gridCol w:w="1077"/>
+        <w:gridCol w:w="1077"/>
+        <w:gridCol w:w="1077"/>
       </w:tblGrid>
       <w:tr>
+        <w:trPr>
+          <w:cantSplit/>
+        </w:trPr>
         <w:tc>
           <w:tcPr>
-            <w:tcW w:type="dxa" w:w="1337"/>
+            <w:tcW w:type="dxa" w:w="1701"/>
             <w:shd w:fill="F0F0F0"/>
             <w:tcBorders>
               <w:bottom w:val="single" w:sz="8" w:space="0" w:color="000000"/>
@@ -3573,7 +3706,7 @@
         </w:tc>
         <w:tc>
           <w:tcPr>
-            <w:tcW w:type="dxa" w:w="1337"/>
+            <w:tcW w:type="dxa" w:w="1304"/>
             <w:shd w:fill="F0F0F0"/>
             <w:tcBorders>
               <w:bottom w:val="single" w:sz="8" w:space="0" w:color="000000"/>
@@ -3596,7 +3729,7 @@
         </w:tc>
         <w:tc>
           <w:tcPr>
-            <w:tcW w:type="dxa" w:w="1337"/>
+            <w:tcW w:type="dxa" w:w="1077"/>
             <w:shd w:fill="F0F0F0"/>
             <w:tcBorders>
               <w:bottom w:val="single" w:sz="8" w:space="0" w:color="000000"/>
@@ -3619,7 +3752,7 @@
         </w:tc>
         <w:tc>
           <w:tcPr>
-            <w:tcW w:type="dxa" w:w="1337"/>
+            <w:tcW w:type="dxa" w:w="1077"/>
             <w:shd w:fill="F0F0F0"/>
             <w:tcBorders>
               <w:bottom w:val="single" w:sz="8" w:space="0" w:color="000000"/>
@@ -3642,7 +3775,7 @@
         </w:tc>
         <w:tc>
           <w:tcPr>
-            <w:tcW w:type="dxa" w:w="1337"/>
+            <w:tcW w:type="dxa" w:w="1077"/>
             <w:shd w:fill="F0F0F0"/>
             <w:tcBorders>
               <w:bottom w:val="single" w:sz="8" w:space="0" w:color="000000"/>
@@ -3665,7 +3798,7 @@
         </w:tc>
         <w:tc>
           <w:tcPr>
-            <w:tcW w:type="dxa" w:w="1337"/>
+            <w:tcW w:type="dxa" w:w="1077"/>
             <w:shd w:fill="F0F0F0"/>
             <w:tcBorders>
               <w:bottom w:val="single" w:sz="8" w:space="0" w:color="000000"/>
@@ -3688,7 +3821,7 @@
         </w:tc>
         <w:tc>
           <w:tcPr>
-            <w:tcW w:type="dxa" w:w="1337"/>
+            <w:tcW w:type="dxa" w:w="1077"/>
             <w:shd w:fill="F0F0F0"/>
             <w:tcBorders>
               <w:bottom w:val="single" w:sz="8" w:space="0" w:color="000000"/>
@@ -3711,9 +3844,12 @@
         </w:tc>
       </w:tr>
       <w:tr>
+        <w:trPr>
+          <w:cantSplit/>
+        </w:trPr>
         <w:tc>
           <w:tcPr>
-            <w:tcW w:type="dxa" w:w="1337"/>
+            <w:tcW w:type="dxa" w:w="1701"/>
           </w:tcPr>
           <w:p>
             <w:pPr>
@@ -3731,7 +3867,7 @@
         </w:tc>
         <w:tc>
           <w:tcPr>
-            <w:tcW w:type="dxa" w:w="1337"/>
+            <w:tcW w:type="dxa" w:w="1304"/>
           </w:tcPr>
           <w:p>
             <w:pPr>
@@ -3749,7 +3885,7 @@
         </w:tc>
         <w:tc>
           <w:tcPr>
-            <w:tcW w:type="dxa" w:w="1337"/>
+            <w:tcW w:type="dxa" w:w="1077"/>
           </w:tcPr>
           <w:p>
             <w:pPr>
@@ -3767,7 +3903,7 @@
         </w:tc>
         <w:tc>
           <w:tcPr>
-            <w:tcW w:type="dxa" w:w="1337"/>
+            <w:tcW w:type="dxa" w:w="1077"/>
           </w:tcPr>
           <w:p>
             <w:pPr>
@@ -3785,7 +3921,7 @@
         </w:tc>
         <w:tc>
           <w:tcPr>
-            <w:tcW w:type="dxa" w:w="1337"/>
+            <w:tcW w:type="dxa" w:w="1077"/>
           </w:tcPr>
           <w:p>
             <w:pPr>
@@ -3803,7 +3939,7 @@
         </w:tc>
         <w:tc>
           <w:tcPr>
-            <w:tcW w:type="dxa" w:w="1337"/>
+            <w:tcW w:type="dxa" w:w="1077"/>
           </w:tcPr>
           <w:p>
             <w:pPr>
@@ -3821,7 +3957,7 @@
         </w:tc>
         <w:tc>
           <w:tcPr>
-            <w:tcW w:type="dxa" w:w="1337"/>
+            <w:tcW w:type="dxa" w:w="1077"/>
           </w:tcPr>
           <w:p>
             <w:pPr>
@@ -3839,9 +3975,12 @@
         </w:tc>
       </w:tr>
       <w:tr>
+        <w:trPr>
+          <w:cantSplit/>
+        </w:trPr>
         <w:tc>
           <w:tcPr>
-            <w:tcW w:type="dxa" w:w="1337"/>
+            <w:tcW w:type="dxa" w:w="1701"/>
           </w:tcPr>
           <w:p>
             <w:pPr>
@@ -3859,7 +3998,7 @@
         </w:tc>
         <w:tc>
           <w:tcPr>
-            <w:tcW w:type="dxa" w:w="1337"/>
+            <w:tcW w:type="dxa" w:w="1304"/>
           </w:tcPr>
           <w:p>
             <w:pPr>
@@ -3877,7 +4016,7 @@
         </w:tc>
         <w:tc>
           <w:tcPr>
-            <w:tcW w:type="dxa" w:w="1337"/>
+            <w:tcW w:type="dxa" w:w="1077"/>
           </w:tcPr>
           <w:p>
             <w:pPr>
@@ -3895,7 +4034,7 @@
         </w:tc>
         <w:tc>
           <w:tcPr>
-            <w:tcW w:type="dxa" w:w="1337"/>
+            <w:tcW w:type="dxa" w:w="1077"/>
           </w:tcPr>
           <w:p>
             <w:pPr>
@@ -3913,7 +4052,7 @@
         </w:tc>
         <w:tc>
           <w:tcPr>
-            <w:tcW w:type="dxa" w:w="1337"/>
+            <w:tcW w:type="dxa" w:w="1077"/>
           </w:tcPr>
           <w:p>
             <w:pPr>
@@ -3931,7 +4070,7 @@
         </w:tc>
         <w:tc>
           <w:tcPr>
-            <w:tcW w:type="dxa" w:w="1337"/>
+            <w:tcW w:type="dxa" w:w="1077"/>
           </w:tcPr>
           <w:p>
             <w:pPr>
@@ -3949,7 +4088,7 @@
         </w:tc>
         <w:tc>
           <w:tcPr>
-            <w:tcW w:type="dxa" w:w="1337"/>
+            <w:tcW w:type="dxa" w:w="1077"/>
           </w:tcPr>
           <w:p>
             <w:pPr>
@@ -3967,9 +4106,12 @@
         </w:tc>
       </w:tr>
       <w:tr>
+        <w:trPr>
+          <w:cantSplit/>
+        </w:trPr>
         <w:tc>
           <w:tcPr>
-            <w:tcW w:type="dxa" w:w="1337"/>
+            <w:tcW w:type="dxa" w:w="1701"/>
           </w:tcPr>
           <w:p>
             <w:pPr>
@@ -3987,7 +4129,7 @@
         </w:tc>
         <w:tc>
           <w:tcPr>
-            <w:tcW w:type="dxa" w:w="1337"/>
+            <w:tcW w:type="dxa" w:w="1304"/>
           </w:tcPr>
           <w:p>
             <w:pPr>
@@ -4005,7 +4147,7 @@
         </w:tc>
         <w:tc>
           <w:tcPr>
-            <w:tcW w:type="dxa" w:w="1337"/>
+            <w:tcW w:type="dxa" w:w="1077"/>
           </w:tcPr>
           <w:p>
             <w:pPr>
@@ -4023,7 +4165,7 @@
         </w:tc>
         <w:tc>
           <w:tcPr>
-            <w:tcW w:type="dxa" w:w="1337"/>
+            <w:tcW w:type="dxa" w:w="1077"/>
           </w:tcPr>
           <w:p>
             <w:pPr>
@@ -4041,7 +4183,7 @@
         </w:tc>
         <w:tc>
           <w:tcPr>
-            <w:tcW w:type="dxa" w:w="1337"/>
+            <w:tcW w:type="dxa" w:w="1077"/>
           </w:tcPr>
           <w:p>
             <w:pPr>
@@ -4059,7 +4201,7 @@
         </w:tc>
         <w:tc>
           <w:tcPr>
-            <w:tcW w:type="dxa" w:w="1337"/>
+            <w:tcW w:type="dxa" w:w="1077"/>
           </w:tcPr>
           <w:p>
             <w:pPr>
@@ -4077,7 +4219,7 @@
         </w:tc>
         <w:tc>
           <w:tcPr>
-            <w:tcW w:type="dxa" w:w="1337"/>
+            <w:tcW w:type="dxa" w:w="1077"/>
           </w:tcPr>
           <w:p>
             <w:pPr>
@@ -4095,9 +4237,12 @@
         </w:tc>
       </w:tr>
       <w:tr>
+        <w:trPr>
+          <w:cantSplit/>
+        </w:trPr>
         <w:tc>
           <w:tcPr>
-            <w:tcW w:type="dxa" w:w="1337"/>
+            <w:tcW w:type="dxa" w:w="1701"/>
           </w:tcPr>
           <w:p>
             <w:pPr>
@@ -4115,7 +4260,7 @@
         </w:tc>
         <w:tc>
           <w:tcPr>
-            <w:tcW w:type="dxa" w:w="1337"/>
+            <w:tcW w:type="dxa" w:w="1304"/>
           </w:tcPr>
           <w:p>
             <w:pPr>
@@ -4133,7 +4278,7 @@
         </w:tc>
         <w:tc>
           <w:tcPr>
-            <w:tcW w:type="dxa" w:w="1337"/>
+            <w:tcW w:type="dxa" w:w="1077"/>
           </w:tcPr>
           <w:p>
             <w:pPr>
@@ -4151,7 +4296,7 @@
         </w:tc>
         <w:tc>
           <w:tcPr>
-            <w:tcW w:type="dxa" w:w="1337"/>
+            <w:tcW w:type="dxa" w:w="1077"/>
           </w:tcPr>
           <w:p>
             <w:pPr>
@@ -4169,7 +4314,7 @@
         </w:tc>
         <w:tc>
           <w:tcPr>
-            <w:tcW w:type="dxa" w:w="1337"/>
+            <w:tcW w:type="dxa" w:w="1077"/>
           </w:tcPr>
           <w:p>
             <w:pPr>
@@ -4187,7 +4332,7 @@
         </w:tc>
         <w:tc>
           <w:tcPr>
-            <w:tcW w:type="dxa" w:w="1337"/>
+            <w:tcW w:type="dxa" w:w="1077"/>
           </w:tcPr>
           <w:p>
             <w:pPr>
@@ -4205,7 +4350,7 @@
         </w:tc>
         <w:tc>
           <w:tcPr>
-            <w:tcW w:type="dxa" w:w="1337"/>
+            <w:tcW w:type="dxa" w:w="1077"/>
           </w:tcPr>
           <w:p>
             <w:pPr>
@@ -4223,9 +4368,12 @@
         </w:tc>
       </w:tr>
       <w:tr>
+        <w:trPr>
+          <w:cantSplit/>
+        </w:trPr>
         <w:tc>
           <w:tcPr>
-            <w:tcW w:type="dxa" w:w="1337"/>
+            <w:tcW w:type="dxa" w:w="1701"/>
           </w:tcPr>
           <w:p>
             <w:pPr>
@@ -4243,7 +4391,7 @@
         </w:tc>
         <w:tc>
           <w:tcPr>
-            <w:tcW w:type="dxa" w:w="1337"/>
+            <w:tcW w:type="dxa" w:w="1304"/>
           </w:tcPr>
           <w:p>
             <w:pPr>
@@ -4261,7 +4409,7 @@
         </w:tc>
         <w:tc>
           <w:tcPr>
-            <w:tcW w:type="dxa" w:w="1337"/>
+            <w:tcW w:type="dxa" w:w="1077"/>
           </w:tcPr>
           <w:p>
             <w:pPr>
@@ -4279,7 +4427,7 @@
         </w:tc>
         <w:tc>
           <w:tcPr>
-            <w:tcW w:type="dxa" w:w="1337"/>
+            <w:tcW w:type="dxa" w:w="1077"/>
           </w:tcPr>
           <w:p>
             <w:pPr>
@@ -4297,7 +4445,7 @@
         </w:tc>
         <w:tc>
           <w:tcPr>
-            <w:tcW w:type="dxa" w:w="1337"/>
+            <w:tcW w:type="dxa" w:w="1077"/>
           </w:tcPr>
           <w:p>
             <w:pPr>
@@ -4315,7 +4463,7 @@
         </w:tc>
         <w:tc>
           <w:tcPr>
-            <w:tcW w:type="dxa" w:w="1337"/>
+            <w:tcW w:type="dxa" w:w="1077"/>
           </w:tcPr>
           <w:p>
             <w:pPr>
@@ -4333,7 +4481,7 @@
         </w:tc>
         <w:tc>
           <w:tcPr>
-            <w:tcW w:type="dxa" w:w="1337"/>
+            <w:tcW w:type="dxa" w:w="1077"/>
           </w:tcPr>
           <w:p>
             <w:pPr>
@@ -4378,6 +4526,7 @@
           <w:insideH w:val="none" w:sz="0" w:space="0" w:color="000000"/>
           <w:insideV w:val="none" w:sz="0" w:space="0" w:color="000000"/>
         </w:tblBorders>
+        <w:tblLayout w:type="fixed"/>
       </w:tblPr>
       <w:tblGrid>
         <w:gridCol w:w="1337"/>
@@ -4389,6 +4538,9 @@
         <w:gridCol w:w="1337"/>
       </w:tblGrid>
       <w:tr>
+        <w:trPr>
+          <w:cantSplit/>
+        </w:trPr>
         <w:tc>
           <w:tcPr>
             <w:tcW w:type="dxa" w:w="1337"/>
@@ -4552,6 +4704,9 @@
         </w:tc>
       </w:tr>
       <w:tr>
+        <w:trPr>
+          <w:cantSplit/>
+        </w:trPr>
         <w:tc>
           <w:tcPr>
             <w:tcW w:type="dxa" w:w="1337"/>
@@ -4680,6 +4835,9 @@
         </w:tc>
       </w:tr>
       <w:tr>
+        <w:trPr>
+          <w:cantSplit/>
+        </w:trPr>
         <w:tc>
           <w:tcPr>
             <w:tcW w:type="dxa" w:w="1337"/>
@@ -4815,6 +4973,9 @@
         </w:tc>
       </w:tr>
       <w:tr>
+        <w:trPr>
+          <w:cantSplit/>
+        </w:trPr>
         <w:tc>
           <w:tcPr>
             <w:tcW w:type="dxa" w:w="1337"/>
@@ -4943,6 +5104,9 @@
         </w:tc>
       </w:tr>
       <w:tr>
+        <w:trPr>
+          <w:cantSplit/>
+        </w:trPr>
         <w:tc>
           <w:tcPr>
             <w:tcW w:type="dxa" w:w="1337"/>
@@ -5071,6 +5235,9 @@
         </w:tc>
       </w:tr>
       <w:tr>
+        <w:trPr>
+          <w:cantSplit/>
+        </w:trPr>
         <w:tc>
           <w:tcPr>
             <w:tcW w:type="dxa" w:w="1337"/>
@@ -5199,6 +5366,9 @@
         </w:tc>
       </w:tr>
       <w:tr>
+        <w:trPr>
+          <w:cantSplit/>
+        </w:trPr>
         <w:tc>
           <w:tcPr>
             <w:tcW w:type="dxa" w:w="1337"/>
@@ -5342,8 +5512,8 @@
       </w:r>
     </w:p>
     <w:sectPr>
-      <w:pgSz w:w="12240" w:h="15840"/>
-      <w:pgMar w:top="1440" w:right="1440" w:bottom="1440" w:left="1440" w:header="720" w:footer="720" w:gutter="0"/>
+      <w:pgSz w:w="11906" w:h="16838"/>
+      <w:pgMar w:top="1701" w:right="1701" w:bottom="1701" w:left="1701" w:header="720" w:footer="720" w:gutter="0"/>
       <w:cols w:space="720"/>
       <w:docGrid w:linePitch="360"/>
     </w:sectPr>

</xml_diff>